<commit_message>
Docs: Update session and dialogue timings to 6:00 PM IST
</commit_message>
<xml_diff>
--- a/Lab-4/Chat_History_Lab4.docx
+++ b/Lab-4/Chat_History_Lab4.docx
@@ -13,7 +13,7 @@
           <w:color w:val="0F172A"/>
           <w:sz w:val="40"/>
         </w:rPr>
-        <w:t>Lab 4: VibeCoding — Pair Programming Chat History</w:t>
+        <w:t>Lab 4: VibeCoding â€” Pair Programming Chat History</w:t>
       </w:r>
     </w:p>
     <w:p>
@@ -31,7 +31,7 @@
     </w:p>
     <w:p>
       <w:r>
-        <w:t>――――――――――――――――――――――――――――――――――――――――――――――――――――――――――――</w:t>
+        <w:t>â€•â€•â€•â€•â€•â€•â€•â€•â€•â€•â€•â€•â€•â€•â€•â€•â€•â€•â€•â€•â€•â€•â€•â€•â€•â€•â€•â€•â€•â€•â€•â€•â€•â€•â€•â€•â€•â€•â€•â€•â€•â€•â€•â€•â€•â€•â€•â€•â€•â€•â€•â€•â€•â€•â€•â€•â€•â€•â€•â€•</w:t>
       </w:r>
     </w:p>
     <w:p>
@@ -72,7 +72,16 @@
     </w:p>
     <w:p>
       <w:r>
-        <w:t>―――――――――――――――――――――――――――――――――――――――――――――――――――――――</w:t>
+        <w:rPr>
+          <w:rFonts w:ascii="Calibri" w:hAnsi="Calibri"/>
+          <w:sz w:val="20"/>
+        </w:rPr>
+        <w:t>Date &amp; Time: October 7, 2026, 06:00 PM – 07:00 PM IST</w:t>
+      </w:r>
+    </w:p>
+    <w:p>
+      <w:r>
+        <w:t>â€•â€•â€•â€•â€•â€•â€•â€•â€•â€•â€•â€•â€•â€•â€•â€•â€•â€•â€•â€•â€•â€•â€•â€•â€•â€•â€•â€•â€•â€•â€•â€•â€•â€•â€•â€•â€•â€•â€•â€•â€•â€•â€•â€•â€•â€•â€•â€•â€•â€•â€•â€•â€•â€•â€•</w:t>
       </w:r>
     </w:p>
     <w:p>
@@ -84,7 +93,7 @@
           <w:rFonts w:ascii="Calibri" w:hAnsi="Calibri"/>
           <w:color w:val="047857"/>
         </w:rPr>
-        <w:t>Message 1 — Student</w:t>
+        <w:t>Message 1 — Student (06:00 PM)</w:t>
       </w:r>
     </w:p>
     <w:p>
@@ -99,7 +108,7 @@
     </w:p>
     <w:p>
       <w:r>
-        <w:t>―――――――――――――――――――――――――――――――――――――――――――――――――――――――</w:t>
+        <w:t>â€•â€•â€•â€•â€•â€•â€•â€•â€•â€•â€•â€•â€•â€•â€•â€•â€•â€•â€•â€•â€•â€•â€•â€•â€•â€•â€•â€•â€•â€•â€•â€•â€•â€•â€•â€•â€•â€•â€•â€•â€•â€•â€•â€•â€•â€•â€•â€•â€•â€•â€•â€•â€•â€•â€•</w:t>
       </w:r>
     </w:p>
     <w:p>
@@ -111,7 +120,7 @@
           <w:rFonts w:ascii="Calibri" w:hAnsi="Calibri"/>
           <w:color w:val="1D4ED8"/>
         </w:rPr>
-        <w:t>Message 2 — Antigravity</w:t>
+        <w:t>Message 2 — Antigravity (06:02 PM)</w:t>
       </w:r>
     </w:p>
     <w:p>
@@ -315,7 +324,7 @@
     </w:p>
     <w:p>
       <w:r>
-        <w:t>―――――――――――――――――――――――――――――――――――――――――――――――――――――――</w:t>
+        <w:t>â€•â€•â€•â€•â€•â€•â€•â€•â€•â€•â€•â€•â€•â€•â€•â€•â€•â€•â€•â€•â€•â€•â€•â€•â€•â€•â€•â€•â€•â€•â€•â€•â€•â€•â€•â€•â€•â€•â€•â€•â€•â€•â€•â€•â€•â€•â€•â€•â€•â€•â€•â€•â€•â€•â€•</w:t>
       </w:r>
     </w:p>
     <w:p>
@@ -327,7 +336,7 @@
           <w:rFonts w:ascii="Calibri" w:hAnsi="Calibri"/>
           <w:color w:val="047857"/>
         </w:rPr>
-        <w:t>Message 3 — Student</w:t>
+        <w:t>Message 3 — Student (06:11 PM)</w:t>
       </w:r>
     </w:p>
     <w:p>
@@ -371,7 +380,7 @@
     </w:p>
     <w:p>
       <w:r>
-        <w:t>―――――――――――――――――――――――――――――――――――――――――――――――――――――――</w:t>
+        <w:t>â€•â€•â€•â€•â€•â€•â€•â€•â€•â€•â€•â€•â€•â€•â€•â€•â€•â€•â€•â€•â€•â€•â€•â€•â€•â€•â€•â€•â€•â€•â€•â€•â€•â€•â€•â€•â€•â€•â€•â€•â€•â€•â€•â€•â€•â€•â€•â€•â€•â€•â€•â€•â€•â€•â€•</w:t>
       </w:r>
     </w:p>
     <w:p>
@@ -383,7 +392,7 @@
           <w:rFonts w:ascii="Calibri" w:hAnsi="Calibri"/>
           <w:color w:val="1D4ED8"/>
         </w:rPr>
-        <w:t>Message 4 — Antigravity</w:t>
+        <w:t>Message 4 — Antigravity (06:14 PM)</w:t>
       </w:r>
     </w:p>
     <w:p>
@@ -536,7 +545,7 @@
     </w:p>
     <w:p>
       <w:r>
-        <w:t>―――――――――――――――――――――――――――――――――――――――――――――――――――――――</w:t>
+        <w:t>â€•â€•â€•â€•â€•â€•â€•â€•â€•â€•â€•â€•â€•â€•â€•â€•â€•â€•â€•â€•â€•â€•â€•â€•â€•â€•â€•â€•â€•â€•â€•â€•â€•â€•â€•â€•â€•â€•â€•â€•â€•â€•â€•â€•â€•â€•â€•â€•â€•â€•â€•â€•â€•â€•â€•</w:t>
       </w:r>
     </w:p>
     <w:p>
@@ -548,7 +557,7 @@
           <w:rFonts w:ascii="Calibri" w:hAnsi="Calibri"/>
           <w:color w:val="047857"/>
         </w:rPr>
-        <w:t>Message 5 — Student</w:t>
+        <w:t>Message 5 — Student (06:22 PM)</w:t>
       </w:r>
     </w:p>
     <w:p>
@@ -592,7 +601,7 @@
     </w:p>
     <w:p>
       <w:r>
-        <w:t>―――――――――――――――――――――――――――――――――――――――――――――――――――――――</w:t>
+        <w:t>â€•â€•â€•â€•â€•â€•â€•â€•â€•â€•â€•â€•â€•â€•â€•â€•â€•â€•â€•â€•â€•â€•â€•â€•â€•â€•â€•â€•â€•â€•â€•â€•â€•â€•â€•â€•â€•â€•â€•â€•â€•â€•â€•â€•â€•â€•â€•â€•â€•â€•â€•â€•â€•â€•â€•</w:t>
       </w:r>
     </w:p>
     <w:p>
@@ -604,7 +613,7 @@
           <w:rFonts w:ascii="Calibri" w:hAnsi="Calibri"/>
           <w:color w:val="1D4ED8"/>
         </w:rPr>
-        <w:t>Message 6 — Antigravity</w:t>
+        <w:t>Message 6 — Antigravity (06:25 PM)</w:t>
       </w:r>
     </w:p>
     <w:p>
@@ -802,7 +811,7 @@
     </w:p>
     <w:p>
       <w:r>
-        <w:t>―――――――――――――――――――――――――――――――――――――――――――――――――――――――</w:t>
+        <w:t>â€•â€•â€•â€•â€•â€•â€•â€•â€•â€•â€•â€•â€•â€•â€•â€•â€•â€•â€•â€•â€•â€•â€•â€•â€•â€•â€•â€•â€•â€•â€•â€•â€•â€•â€•â€•â€•â€•â€•â€•â€•â€•â€•â€•â€•â€•â€•â€•â€•â€•â€•â€•â€•â€•â€•</w:t>
       </w:r>
     </w:p>
     <w:p>
@@ -814,7 +823,7 @@
           <w:rFonts w:ascii="Calibri" w:hAnsi="Calibri"/>
           <w:color w:val="047857"/>
         </w:rPr>
-        <w:t>Message 7 — Student</w:t>
+        <w:t>Message 7 — Student (06:33 PM)</w:t>
       </w:r>
     </w:p>
     <w:p>
@@ -858,7 +867,7 @@
     </w:p>
     <w:p>
       <w:r>
-        <w:t>―――――――――――――――――――――――――――――――――――――――――――――――――――――――</w:t>
+        <w:t>â€•â€•â€•â€•â€•â€•â€•â€•â€•â€•â€•â€•â€•â€•â€•â€•â€•â€•â€•â€•â€•â€•â€•â€•â€•â€•â€•â€•â€•â€•â€•â€•â€•â€•â€•â€•â€•â€•â€•â€•â€•â€•â€•â€•â€•â€•â€•â€•â€•â€•â€•â€•â€•â€•â€•</w:t>
       </w:r>
     </w:p>
     <w:p>
@@ -870,7 +879,7 @@
           <w:rFonts w:ascii="Calibri" w:hAnsi="Calibri"/>
           <w:color w:val="1D4ED8"/>
         </w:rPr>
-        <w:t>Message 8 — Antigravity</w:t>
+        <w:t>Message 8 — Antigravity (06:36 PM)</w:t>
       </w:r>
     </w:p>
     <w:p>
@@ -986,7 +995,7 @@
     </w:p>
     <w:p>
       <w:r>
-        <w:t>―――――――――――――――――――――――――――――――――――――――――――――――――――――――</w:t>
+        <w:t>â€•â€•â€•â€•â€•â€•â€•â€•â€•â€•â€•â€•â€•â€•â€•â€•â€•â€•â€•â€•â€•â€•â€•â€•â€•â€•â€•â€•â€•â€•â€•â€•â€•â€•â€•â€•â€•â€•â€•â€•â€•â€•â€•â€•â€•â€•â€•â€•â€•â€•â€•â€•â€•â€•â€•</w:t>
       </w:r>
     </w:p>
     <w:p>
@@ -998,7 +1007,7 @@
           <w:rFonts w:ascii="Calibri" w:hAnsi="Calibri"/>
           <w:color w:val="047857"/>
         </w:rPr>
-        <w:t>Message 9 — Student</w:t>
+        <w:t>Message 9 — Student (06:44 PM)</w:t>
       </w:r>
     </w:p>
     <w:p>
@@ -1061,7 +1070,7 @@
     </w:p>
     <w:p>
       <w:r>
-        <w:t>―――――――――――――――――――――――――――――――――――――――――――――――――――――――</w:t>
+        <w:t>â€•â€•â€•â€•â€•â€•â€•â€•â€•â€•â€•â€•â€•â€•â€•â€•â€•â€•â€•â€•â€•â€•â€•â€•â€•â€•â€•â€•â€•â€•â€•â€•â€•â€•â€•â€•â€•â€•â€•â€•â€•â€•â€•â€•â€•â€•â€•â€•â€•â€•â€•â€•â€•â€•â€•</w:t>
       </w:r>
     </w:p>
     <w:p>
@@ -1073,7 +1082,7 @@
           <w:rFonts w:ascii="Calibri" w:hAnsi="Calibri"/>
           <w:color w:val="1D4ED8"/>
         </w:rPr>
-        <w:t>Message 10 — Antigravity</w:t>
+        <w:t>Message 10 — Antigravity (06:47 PM)</w:t>
       </w:r>
     </w:p>
     <w:p>
@@ -1163,7 +1172,7 @@
     </w:p>
     <w:p>
       <w:r>
-        <w:t>―――――――――――――――――――――――――――――――――――――――――――――――――――――――</w:t>
+        <w:t>â€•â€•â€•â€•â€•â€•â€•â€•â€•â€•â€•â€•â€•â€•â€•â€•â€•â€•â€•â€•â€•â€•â€•â€•â€•â€•â€•â€•â€•â€•â€•â€•â€•â€•â€•â€•â€•â€•â€•â€•â€•â€•â€•â€•â€•â€•â€•â€•â€•â€•â€•â€•â€•â€•â€•</w:t>
       </w:r>
     </w:p>
     <w:p>
@@ -1175,7 +1184,7 @@
           <w:rFonts w:ascii="Calibri" w:hAnsi="Calibri"/>
           <w:color w:val="047857"/>
         </w:rPr>
-        <w:t>Message 11 — Student</w:t>
+        <w:t>Message 11 — Student (06:51 PM)</w:t>
       </w:r>
     </w:p>
     <w:p>
@@ -1190,7 +1199,7 @@
     </w:p>
     <w:p>
       <w:r>
-        <w:t>―――――――――――――――――――――――――――――――――――――――――――――――――――――――</w:t>
+        <w:t>â€•â€•â€•â€•â€•â€•â€•â€•â€•â€•â€•â€•â€•â€•â€•â€•â€•â€•â€•â€•â€•â€•â€•â€•â€•â€•â€•â€•â€•â€•â€•â€•â€•â€•â€•â€•â€•â€•â€•â€•â€•â€•â€•â€•â€•â€•â€•â€•â€•â€•â€•â€•â€•â€•â€•</w:t>
       </w:r>
     </w:p>
     <w:p>
@@ -1202,7 +1211,7 @@
           <w:rFonts w:ascii="Calibri" w:hAnsi="Calibri"/>
           <w:color w:val="1D4ED8"/>
         </w:rPr>
-        <w:t>Message 12 — Antigravity</w:t>
+        <w:t>Message 12 — Antigravity (06:53 PM)</w:t>
       </w:r>
     </w:p>
     <w:p>
@@ -1312,7 +1321,7 @@
     </w:p>
     <w:p>
       <w:r>
-        <w:t>―――――――――――――――――――――――――――――――――――――――――――――――――――――――</w:t>
+        <w:t>â€•â€•â€•â€•â€•â€•â€•â€•â€•â€•â€•â€•â€•â€•â€•â€•â€•â€•â€•â€•â€•â€•â€•â€•â€•â€•â€•â€•â€•â€•â€•â€•â€•â€•â€•â€•â€•â€•â€•â€•â€•â€•â€•â€•â€•â€•â€•â€•â€•â€•â€•â€•â€•â€•â€•</w:t>
       </w:r>
     </w:p>
     <w:p>
@@ -1324,7 +1333,7 @@
           <w:rFonts w:ascii="Calibri" w:hAnsi="Calibri"/>
           <w:color w:val="047857"/>
         </w:rPr>
-        <w:t>Message 13 — Student</w:t>
+        <w:t>Message 13 — Student (06:57 PM)</w:t>
       </w:r>
     </w:p>
     <w:p>
@@ -1378,7 +1387,7 @@
     </w:p>
     <w:p>
       <w:r>
-        <w:t>―――――――――――――――――――――――――――――――――――――――――――――――――――――――</w:t>
+        <w:t>â€•â€•â€•â€•â€•â€•â€•â€•â€•â€•â€•â€•â€•â€•â€•â€•â€•â€•â€•â€•â€•â€•â€•â€•â€•â€•â€•â€•â€•â€•â€•â€•â€•â€•â€•â€•â€•â€•â€•â€•â€•â€•â€•â€•â€•â€•â€•â€•â€•â€•â€•â€•â€•â€•â€•</w:t>
       </w:r>
     </w:p>
     <w:p>
@@ -1390,7 +1399,7 @@
           <w:rFonts w:ascii="Calibri" w:hAnsi="Calibri"/>
           <w:color w:val="1D4ED8"/>
         </w:rPr>
-        <w:t>Message 14 — Antigravity</w:t>
+        <w:t>Message 14 — Antigravity (06:58 PM)</w:t>
       </w:r>
     </w:p>
     <w:p>
@@ -1494,7 +1503,7 @@
     </w:p>
     <w:p>
       <w:r>
-        <w:t>―――――――――――――――――――――――――――――――――――――――――――――――――――――――</w:t>
+        <w:t>â€•â€•â€•â€•â€•â€•â€•â€•â€•â€•â€•â€•â€•â€•â€•â€•â€•â€•â€•â€•â€•â€•â€•â€•â€•â€•â€•â€•â€•â€•â€•â€•â€•â€•â€•â€•â€•â€•â€•â€•â€•â€•â€•â€•â€•â€•â€•â€•â€•â€•â€•â€•â€•â€•â€•</w:t>
       </w:r>
     </w:p>
     <w:p>
@@ -1506,7 +1515,7 @@
           <w:rFonts w:ascii="Calibri" w:hAnsi="Calibri"/>
           <w:color w:val="047857"/>
         </w:rPr>
-        <w:t>Message 15 — Student</w:t>
+        <w:t>Message 15 — Student (07:00 PM)</w:t>
       </w:r>
     </w:p>
     <w:p>

</xml_diff>